<commit_message>
Atualiza template do relatório mensal de obra civil
</commit_message>
<xml_diff>
--- a/templates/relatorio-mensal-obra-civil.docx
+++ b/templates/relatorio-mensal-obra-civil.docx
@@ -1,6 +1,6 @@
 
 <file path=word/document.xml><?xml version="1.0" encoding="utf-8"?>
-<w:document xmlns:wpc="http://schemas.microsoft.com/office/word/2010/wordprocessingCanvas" xmlns:cx="http://schemas.microsoft.com/office/drawing/2014/chartex" xmlns:cx1="http://schemas.microsoft.com/office/drawing/2015/9/8/chartex" xmlns:cx2="http://schemas.microsoft.com/office/drawing/2015/10/21/chartex" xmlns:cx3="http://schemas.microsoft.com/office/drawing/2016/5/9/chartex" xmlns:cx4="http://schemas.microsoft.com/office/drawing/2016/5/10/chartex" xmlns:cx5="http://schemas.microsoft.com/office/drawing/2016/5/11/chartex" xmlns:cx6="http://schemas.microsoft.com/office/drawing/2016/5/12/chartex" xmlns:cx7="http://schemas.microsoft.com/office/drawing/2016/5/13/chartex" xmlns:cx8="http://schemas.microsoft.com/office/drawing/2016/5/14/chartex" xmlns:mc="http://schemas.openxmlformats.org/markup-compatibility/2006" xmlns:aink="http://schemas.microsoft.com/office/drawing/2016/ink" xmlns:am3d="http://schemas.microsoft.com/office/drawing/2017/model3d" xmlns:o="urn:schemas-microsoft-com:office:office" xmlns:oel="http://schemas.microsoft.com/office/2019/extlst" xmlns:r="http://schemas.openxmlformats.org/officeDocument/2006/relationships" xmlns:m="http://schemas.openxmlformats.org/officeDocument/2006/math" xmlns:v="urn:schemas-microsoft-com:vml" xmlns:wp14="http://schemas.microsoft.com/office/word/2010/wordprocessingDrawing" xmlns:wp="http://schemas.openxmlformats.org/drawingml/2006/wordprocessingDrawing" xmlns:w10="urn:schemas-microsoft-com:office:word" xmlns:w="http://schemas.openxmlformats.org/wordprocessingml/2006/main" xmlns:w14="http://schemas.microsoft.com/office/word/2010/wordml" xmlns:w15="http://schemas.microsoft.com/office/word/2012/wordml" xmlns:w16cex="http://schemas.microsoft.com/office/word/2018/wordml/cex" xmlns:w16cid="http://schemas.microsoft.com/office/word/2016/wordml/cid" xmlns:w16="http://schemas.microsoft.com/office/word/2018/wordml" xmlns:w16du="http://schemas.microsoft.com/office/word/2023/wordml/word16du" xmlns:w16sdtdh="http://schemas.microsoft.com/office/word/2020/wordml/sdtdatahash" xmlns:w16sdtfl="http://schemas.microsoft.com/office/word/2024/wordml/sdtformatlock" xmlns:w16se="http://schemas.microsoft.com/office/word/2015/wordml/symex" xmlns:wpg="http://schemas.microsoft.com/office/word/2010/wordprocessingGroup" xmlns:wpi="http://schemas.microsoft.com/office/word/2010/wordprocessingInk" xmlns:wne="http://schemas.microsoft.com/office/word/2006/wordml" xmlns:wps="http://schemas.microsoft.com/office/word/2010/wordprocessingShape" mc:Ignorable="w14 w15 w16se w16cid w16 w16cex w16sdtdh w16sdtfl w16du wp14">
+<w:document xmlns:wpc="http://schemas.microsoft.com/office/word/2010/wordprocessingCanvas" xmlns:cx="http://schemas.microsoft.com/office/drawing/2014/chartex" xmlns:cx1="http://schemas.microsoft.com/office/drawing/2015/9/8/chartex" xmlns:cx2="http://schemas.microsoft.com/office/drawing/2015/10/21/chartex" xmlns:cx3="http://schemas.microsoft.com/office/drawing/2016/5/9/chartex" xmlns:cx4="http://schemas.microsoft.com/office/drawing/2016/5/10/chartex" xmlns:cx5="http://schemas.microsoft.com/office/drawing/2016/5/11/chartex" xmlns:cx6="http://schemas.microsoft.com/office/drawing/2016/5/12/chartex" xmlns:cx7="http://schemas.microsoft.com/office/drawing/2016/5/13/chartex" xmlns:cx8="http://schemas.microsoft.com/office/drawing/2016/5/14/chartex" xmlns:mc="http://schemas.openxmlformats.org/markup-compatibility/2006" xmlns:aink="http://schemas.microsoft.com/office/drawing/2016/ink" xmlns:am3d="http://schemas.microsoft.com/office/drawing/2017/model3d" xmlns:o="urn:schemas-microsoft-com:office:office" xmlns:oel="http://schemas.microsoft.com/office/2019/extlst" xmlns:r="http://schemas.openxmlformats.org/officeDocument/2006/relationships" xmlns:m="http://schemas.openxmlformats.org/officeDocument/2006/math" xmlns:v="urn:schemas-microsoft-com:vml" xmlns:wp14="http://schemas.microsoft.com/office/word/2010/wordprocessingDrawing" xmlns:wp="http://schemas.openxmlformats.org/drawingml/2006/wordprocessingDrawing" xmlns:w10="urn:schemas-microsoft-com:office:word" xmlns:w="http://schemas.openxmlformats.org/wordprocessingml/2006/main" xmlns:w14="http://schemas.microsoft.com/office/word/2010/wordml" xmlns:w15="http://schemas.microsoft.com/office/word/2012/wordml" xmlns:w16cei="http://schemas.microsoft.com/office/word/2026/wordml/cei" xmlns:w16cex="http://schemas.microsoft.com/office/word/2018/wordml/cex" xmlns:w16cid="http://schemas.microsoft.com/office/word/2016/wordml/cid" xmlns:w16="http://schemas.microsoft.com/office/word/2018/wordml" xmlns:w16du="http://schemas.microsoft.com/office/word/2023/wordml/word16du" xmlns:w16sdtdh="http://schemas.microsoft.com/office/word/2020/wordml/sdtdatahash" xmlns:w16sdtfl="http://schemas.microsoft.com/office/word/2024/wordml/sdtformatlock" xmlns:w16se="http://schemas.microsoft.com/office/word/2015/wordml/symex" xmlns:wpg="http://schemas.microsoft.com/office/word/2010/wordprocessingGroup" xmlns:wpi="http://schemas.microsoft.com/office/word/2010/wordprocessingInk" xmlns:wne="http://schemas.microsoft.com/office/word/2006/wordml" xmlns:wps="http://schemas.microsoft.com/office/word/2010/wordprocessingShape" mc:Ignorable="w14 w15 w16se w16cid w16 w16cex w16sdtdh w16sdtfl w16du wp14">
   <w:background w:color="FFFFFF"/>
   <w:body>
     <w:tbl>
@@ -100,7 +100,7 @@
                 <w:bCs/>
                 <w:sz w:val="24"/>
               </w:rPr>
-              <w:t xml:space="preserve">DIRETORIA DE PAVIMENTAÇÃO E REPAROS</w:t>
+              <w:t>DIRETORIA DE PAVIMENTAÇÃO E REPAROS</w:t>
             </w:r>
           </w:p>
         </w:tc>
@@ -158,7 +158,7 @@
                 <w:bCs/>
                 <w:sz w:val="24"/>
               </w:rPr>
-              <w:t xml:space="preserve">{periodo}</w:t>
+              <w:t>{periodo}</w:t>
             </w:r>
           </w:p>
         </w:tc>
@@ -219,13 +219,7 @@
     </w:p>
     <w:p>
       <w:pPr>
-        <w:pStyle w:val="PargrafodaLista"/>
-        <w:keepNext w:val="0"/>
-        <w:keepLines w:val="0"/>
-        <w:numPr>
-          <w:ilvl w:val="0"/>
-          <w:numId w:val="16"/>
-        </w:numPr>
+        <w:ind w:firstLine="426"/>
         <w:rPr>
           <w:rFonts w:ascii="Bookman Old Style" w:eastAsia="Bookman Old Style" w:hAnsi="Bookman Old Style" w:cs="Bookman Old Style"/>
           <w:sz w:val="24"/>
@@ -236,20 +230,27 @@
           <w:rFonts w:ascii="Bookman Old Style" w:eastAsia="Bookman Old Style" w:hAnsi="Bookman Old Style" w:cs="Bookman Old Style"/>
           <w:sz w:val="24"/>
         </w:rPr>
-        <w:t>{-w:p despachos}</w:t>
+        <w:t xml:space="preserve">{-w:p </w:t>
       </w:r>
+      <w:proofErr w:type="gramStart"/>
       <w:r>
         <w:rPr>
           <w:rFonts w:ascii="Bookman Old Style" w:eastAsia="Bookman Old Style" w:hAnsi="Bookman Old Style" w:cs="Bookman Old Style"/>
           <w:sz w:val="24"/>
         </w:rPr>
-        <w:t>{processo} - ION/ Presidência;</w:t>
+        <w:t>despachos}{</w:t>
+      </w:r>
+      <w:proofErr w:type="gramEnd"/>
+      <w:r>
+        <w:rPr>
+          <w:rFonts w:ascii="Bookman Old Style" w:eastAsia="Bookman Old Style" w:hAnsi="Bookman Old Style" w:cs="Bookman Old Style"/>
+          <w:sz w:val="24"/>
+        </w:rPr>
+        <w:t>processo} - ION/ Presidência;</w:t>
       </w:r>
     </w:p>
     <w:p>
       <w:pPr>
-        <w:keepNext w:val="0"/>
-        <w:keepLines w:val="0"/>
         <w:rPr>
           <w:rFonts w:ascii="Bookman Old Style" w:eastAsia="Bookman Old Style" w:hAnsi="Bookman Old Style" w:cs="Bookman Old Style"/>
           <w:sz w:val="24"/>
@@ -274,15 +275,6 @@
     </w:p>
     <w:p>
       <w:pPr>
-        <w:ind w:left="720"/>
-        <w:rPr>
-          <w:rFonts w:ascii="Bookman Old Style" w:eastAsia="Bookman Old Style" w:hAnsi="Bookman Old Style" w:cs="Bookman Old Style"/>
-          <w:sz w:val="24"/>
-        </w:rPr>
-      </w:pPr>
-    </w:p>
-    <w:p>
-      <w:pPr>
         <w:numPr>
           <w:ilvl w:val="0"/>
           <w:numId w:val="1"/>
@@ -299,7 +291,7 @@
           <w:b/>
           <w:sz w:val="24"/>
         </w:rPr>
-        <w:t xml:space="preserve">Colabs de Obra civil respondidos:</w:t>
+        <w:t>Colabs de Obra civil respondidos:</w:t>
       </w:r>
     </w:p>
     <w:p>
@@ -331,11 +323,8 @@
     </w:p>
     <w:p>
       <w:pPr>
-        <w:numPr>
-          <w:ilvl w:val="0"/>
-          <w:numId w:val="6"/>
-        </w:numPr>
         <w:spacing w:line="360" w:lineRule="auto"/>
+        <w:ind w:firstLine="426"/>
         <w:rPr>
           <w:rFonts w:ascii="Bookman Old Style" w:eastAsia="Bookman Old Style" w:hAnsi="Bookman Old Style" w:cs="Bookman Old Style"/>
           <w:sz w:val="24"/>
@@ -346,31 +335,24 @@
           <w:rFonts w:ascii="Bookman Old Style" w:eastAsia="Bookman Old Style" w:hAnsi="Bookman Old Style" w:cs="Bookman Old Style"/>
           <w:sz w:val="24"/>
         </w:rPr>
-        <w:t>{-w:p colabs}</w:t>
+        <w:t xml:space="preserve">{-w:p </w:t>
       </w:r>
+      <w:proofErr w:type="gramStart"/>
       <w:r>
         <w:rPr>
           <w:rFonts w:ascii="Bookman Old Style" w:eastAsia="Bookman Old Style" w:hAnsi="Bookman Old Style" w:cs="Bookman Old Style"/>
           <w:sz w:val="24"/>
         </w:rPr>
-        <w:t>{colab}</w:t>
+        <w:t>colabs}{</w:t>
       </w:r>
+      <w:proofErr w:type="gramEnd"/>
       <w:r>
         <w:rPr>
           <w:rFonts w:ascii="Bookman Old Style" w:eastAsia="Bookman Old Style" w:hAnsi="Bookman Old Style" w:cs="Bookman Old Style"/>
           <w:sz w:val="24"/>
         </w:rPr>
-        <w:t>{/colabs}</w:t>
+        <w:t>colab}{/colabs}</w:t>
       </w:r>
-    </w:p>
-    <w:p>
-      <w:pPr>
-        <w:spacing w:line="360" w:lineRule="auto"/>
-        <w:rPr>
-          <w:rFonts w:ascii="Bookman Old Style" w:eastAsia="Bookman Old Style" w:hAnsi="Bookman Old Style" w:cs="Bookman Old Style"/>
-          <w:sz w:val="24"/>
-        </w:rPr>
-      </w:pPr>
     </w:p>
     <w:p>
       <w:pPr>
@@ -400,16 +382,6 @@
           <w:rFonts w:ascii="Bookman Old Style" w:eastAsia="Bookman Old Style" w:hAnsi="Bookman Old Style" w:cs="Bookman Old Style"/>
           <w:sz w:val="24"/>
         </w:rPr>
-      </w:pPr>
-    </w:p>
-    <w:p>
-      <w:pPr>
-        <w:spacing w:line="360" w:lineRule="auto"/>
-        <w:jc w:val="both"/>
-        <w:rPr>
-          <w:rFonts w:ascii="Bookman Old Style" w:eastAsia="Bookman Old Style" w:hAnsi="Bookman Old Style" w:cs="Bookman Old Style"/>
-          <w:sz w:val="24"/>
-        </w:rPr>
         <w:sectPr>
           <w:footnotePr>
             <w:pos w:val="beneathText"/>
@@ -447,13 +419,7 @@
     </w:p>
     <w:p>
       <w:pPr>
-        <w:pStyle w:val="PargrafodaLista"/>
-        <w:keepNext w:val="0"/>
-        <w:keepLines w:val="0"/>
-        <w:numPr>
-          <w:ilvl w:val="0"/>
-          <w:numId w:val="16"/>
-        </w:numPr>
+        <w:ind w:firstLine="426"/>
         <w:rPr>
           <w:rFonts w:ascii="Bookman Old Style" w:hAnsi="Bookman Old Style"/>
           <w:sz w:val="24"/>
@@ -466,15 +432,43 @@
           <w:sz w:val="24"/>
           <w:szCs w:val="24"/>
         </w:rPr>
-        <w:t>{-w:p pares}</w:t>
+        <w:t>{-</w:t>
       </w:r>
+      <w:proofErr w:type="spellStart"/>
       <w:r>
         <w:rPr>
           <w:rFonts w:ascii="Bookman Old Style" w:hAnsi="Bookman Old Style"/>
           <w:sz w:val="24"/>
           <w:szCs w:val="24"/>
         </w:rPr>
-        <w:t xml:space="preserve">Abertura do processo nº </w:t>
+        <w:t>w:p</w:t>
+      </w:r>
+      <w:proofErr w:type="spellEnd"/>
+      <w:r>
+        <w:rPr>
+          <w:rFonts w:ascii="Bookman Old Style" w:hAnsi="Bookman Old Style"/>
+          <w:sz w:val="24"/>
+          <w:szCs w:val="24"/>
+        </w:rPr>
+        <w:t xml:space="preserve"> </w:t>
+      </w:r>
+      <w:proofErr w:type="gramStart"/>
+      <w:r>
+        <w:rPr>
+          <w:rFonts w:ascii="Bookman Old Style" w:hAnsi="Bookman Old Style"/>
+          <w:sz w:val="24"/>
+          <w:szCs w:val="24"/>
+        </w:rPr>
+        <w:t>pares}Abertura</w:t>
+      </w:r>
+      <w:proofErr w:type="gramEnd"/>
+      <w:r>
+        <w:rPr>
+          <w:rFonts w:ascii="Bookman Old Style" w:hAnsi="Bookman Old Style"/>
+          <w:sz w:val="24"/>
+          <w:szCs w:val="24"/>
+        </w:rPr>
+        <w:t xml:space="preserve"> do processo nº </w:t>
       </w:r>
       <w:r>
         <w:rPr>
@@ -513,8 +507,6 @@
     </w:p>
     <w:p>
       <w:pPr>
-        <w:keepNext w:val="0"/>
-        <w:keepLines w:val="0"/>
         <w:rPr>
           <w:rFonts w:ascii="Bookman Old Style" w:hAnsi="Bookman Old Style"/>
           <w:sz w:val="24"/>
@@ -529,28 +521,6 @@
         </w:rPr>
         <w:t>{/pares}</w:t>
       </w:r>
-    </w:p>
-    <w:p>
-      <w:pPr>
-        <w:jc w:val="both"/>
-        <w:rPr>
-          <w:rFonts w:ascii="Bookman Old Style" w:hAnsi="Bookman Old Style"/>
-          <w:b/>
-          <w:sz w:val="24"/>
-          <w:szCs w:val="24"/>
-        </w:rPr>
-      </w:pPr>
-    </w:p>
-    <w:p>
-      <w:pPr>
-        <w:jc w:val="both"/>
-        <w:rPr>
-          <w:rFonts w:ascii="Bookman Old Style" w:hAnsi="Bookman Old Style"/>
-          <w:b/>
-          <w:sz w:val="24"/>
-          <w:szCs w:val="24"/>
-        </w:rPr>
-      </w:pPr>
     </w:p>
     <w:p>
       <w:pPr>
@@ -589,13 +559,7 @@
     </w:p>
     <w:p>
       <w:pPr>
-        <w:pStyle w:val="PargrafodaLista"/>
-        <w:keepNext w:val="0"/>
-        <w:keepLines w:val="0"/>
-        <w:numPr>
-          <w:ilvl w:val="0"/>
-          <w:numId w:val="16"/>
-        </w:numPr>
+        <w:ind w:firstLine="426"/>
         <w:rPr>
           <w:rFonts w:ascii="Bookman Old Style" w:hAnsi="Bookman Old Style"/>
           <w:sz w:val="24"/>
@@ -608,21 +572,11 @@
           <w:sz w:val="24"/>
           <w:szCs w:val="24"/>
         </w:rPr>
-        <w:t>{-w:p enderecos}</w:t>
-      </w:r>
-      <w:r>
-        <w:rPr>
-          <w:rFonts w:ascii="Bookman Old Style" w:hAnsi="Bookman Old Style"/>
-          <w:sz w:val="24"/>
-          <w:szCs w:val="24"/>
-        </w:rPr>
-        <w:t xml:space="preserve">{endereco} – {bairro}.</w:t>
+        <w:t>{-w:p enderecos}{endereco} – {bairro}.</w:t>
       </w:r>
     </w:p>
     <w:p>
       <w:pPr>
-        <w:keepNext w:val="0"/>
-        <w:keepLines w:val="0"/>
         <w:rPr>
           <w:rFonts w:ascii="Bookman Old Style" w:hAnsi="Bookman Old Style"/>
           <w:sz w:val="24"/>
@@ -635,7 +589,25 @@
           <w:sz w:val="24"/>
           <w:szCs w:val="24"/>
         </w:rPr>
-        <w:t>{/enderecos}</w:t>
+        <w:t>{/</w:t>
+      </w:r>
+      <w:proofErr w:type="spellStart"/>
+      <w:r>
+        <w:rPr>
+          <w:rFonts w:ascii="Bookman Old Style" w:hAnsi="Bookman Old Style"/>
+          <w:sz w:val="24"/>
+          <w:szCs w:val="24"/>
+        </w:rPr>
+        <w:t>enderecos</w:t>
+      </w:r>
+      <w:proofErr w:type="spellEnd"/>
+      <w:r>
+        <w:rPr>
+          <w:rFonts w:ascii="Bookman Old Style" w:hAnsi="Bookman Old Style"/>
+          <w:sz w:val="24"/>
+          <w:szCs w:val="24"/>
+        </w:rPr>
+        <w:t>}</w:t>
       </w:r>
     </w:p>
     <w:sectPr>
@@ -653,7 +625,7 @@
 </file>
 
 <file path=word/endnotes.xml><?xml version="1.0" encoding="utf-8"?>
-<w:endnotes xmlns:wpc="http://schemas.microsoft.com/office/word/2010/wordprocessingCanvas" xmlns:cx="http://schemas.microsoft.com/office/drawing/2014/chartex" xmlns:cx1="http://schemas.microsoft.com/office/drawing/2015/9/8/chartex" xmlns:cx2="http://schemas.microsoft.com/office/drawing/2015/10/21/chartex" xmlns:cx3="http://schemas.microsoft.com/office/drawing/2016/5/9/chartex" xmlns:cx4="http://schemas.microsoft.com/office/drawing/2016/5/10/chartex" xmlns:cx5="http://schemas.microsoft.com/office/drawing/2016/5/11/chartex" xmlns:cx6="http://schemas.microsoft.com/office/drawing/2016/5/12/chartex" xmlns:cx7="http://schemas.microsoft.com/office/drawing/2016/5/13/chartex" xmlns:cx8="http://schemas.microsoft.com/office/drawing/2016/5/14/chartex" xmlns:mc="http://schemas.openxmlformats.org/markup-compatibility/2006" xmlns:aink="http://schemas.microsoft.com/office/drawing/2016/ink" xmlns:am3d="http://schemas.microsoft.com/office/drawing/2017/model3d" xmlns:o="urn:schemas-microsoft-com:office:office" xmlns:oel="http://schemas.microsoft.com/office/2019/extlst" xmlns:r="http://schemas.openxmlformats.org/officeDocument/2006/relationships" xmlns:m="http://schemas.openxmlformats.org/officeDocument/2006/math" xmlns:v="urn:schemas-microsoft-com:vml" xmlns:wp14="http://schemas.microsoft.com/office/word/2010/wordprocessingDrawing" xmlns:wp="http://schemas.openxmlformats.org/drawingml/2006/wordprocessingDrawing" xmlns:w10="urn:schemas-microsoft-com:office:word" xmlns:w="http://schemas.openxmlformats.org/wordprocessingml/2006/main" xmlns:w14="http://schemas.microsoft.com/office/word/2010/wordml" xmlns:w15="http://schemas.microsoft.com/office/word/2012/wordml" xmlns:w16cex="http://schemas.microsoft.com/office/word/2018/wordml/cex" xmlns:w16cid="http://schemas.microsoft.com/office/word/2016/wordml/cid" xmlns:w16="http://schemas.microsoft.com/office/word/2018/wordml" xmlns:w16du="http://schemas.microsoft.com/office/word/2023/wordml/word16du" xmlns:w16sdtdh="http://schemas.microsoft.com/office/word/2020/wordml/sdtdatahash" xmlns:w16sdtfl="http://schemas.microsoft.com/office/word/2024/wordml/sdtformatlock" xmlns:w16se="http://schemas.microsoft.com/office/word/2015/wordml/symex" xmlns:wpg="http://schemas.microsoft.com/office/word/2010/wordprocessingGroup" xmlns:wpi="http://schemas.microsoft.com/office/word/2010/wordprocessingInk" xmlns:wne="http://schemas.microsoft.com/office/word/2006/wordml" xmlns:wps="http://schemas.microsoft.com/office/word/2010/wordprocessingShape" mc:Ignorable="w14 w15 w16se w16cid w16 w16cex w16sdtdh w16sdtfl w16du wp14">
+<w:endnotes xmlns:wpc="http://schemas.microsoft.com/office/word/2010/wordprocessingCanvas" xmlns:cx="http://schemas.microsoft.com/office/drawing/2014/chartex" xmlns:cx1="http://schemas.microsoft.com/office/drawing/2015/9/8/chartex" xmlns:cx2="http://schemas.microsoft.com/office/drawing/2015/10/21/chartex" xmlns:cx3="http://schemas.microsoft.com/office/drawing/2016/5/9/chartex" xmlns:cx4="http://schemas.microsoft.com/office/drawing/2016/5/10/chartex" xmlns:cx5="http://schemas.microsoft.com/office/drawing/2016/5/11/chartex" xmlns:cx6="http://schemas.microsoft.com/office/drawing/2016/5/12/chartex" xmlns:cx7="http://schemas.microsoft.com/office/drawing/2016/5/13/chartex" xmlns:cx8="http://schemas.microsoft.com/office/drawing/2016/5/14/chartex" xmlns:mc="http://schemas.openxmlformats.org/markup-compatibility/2006" xmlns:aink="http://schemas.microsoft.com/office/drawing/2016/ink" xmlns:am3d="http://schemas.microsoft.com/office/drawing/2017/model3d" xmlns:o="urn:schemas-microsoft-com:office:office" xmlns:oel="http://schemas.microsoft.com/office/2019/extlst" xmlns:r="http://schemas.openxmlformats.org/officeDocument/2006/relationships" xmlns:m="http://schemas.openxmlformats.org/officeDocument/2006/math" xmlns:v="urn:schemas-microsoft-com:vml" xmlns:wp14="http://schemas.microsoft.com/office/word/2010/wordprocessingDrawing" xmlns:wp="http://schemas.openxmlformats.org/drawingml/2006/wordprocessingDrawing" xmlns:w10="urn:schemas-microsoft-com:office:word" xmlns:w="http://schemas.openxmlformats.org/wordprocessingml/2006/main" xmlns:w14="http://schemas.microsoft.com/office/word/2010/wordml" xmlns:w15="http://schemas.microsoft.com/office/word/2012/wordml" xmlns:w16cei="http://schemas.microsoft.com/office/word/2026/wordml/cei" xmlns:w16cex="http://schemas.microsoft.com/office/word/2018/wordml/cex" xmlns:w16cid="http://schemas.microsoft.com/office/word/2016/wordml/cid" xmlns:w16="http://schemas.microsoft.com/office/word/2018/wordml" xmlns:w16du="http://schemas.microsoft.com/office/word/2023/wordml/word16du" xmlns:w16sdtdh="http://schemas.microsoft.com/office/word/2020/wordml/sdtdatahash" xmlns:w16sdtfl="http://schemas.microsoft.com/office/word/2024/wordml/sdtformatlock" xmlns:w16se="http://schemas.microsoft.com/office/word/2015/wordml/symex" xmlns:wpg="http://schemas.microsoft.com/office/word/2010/wordprocessingGroup" xmlns:wpi="http://schemas.microsoft.com/office/word/2010/wordprocessingInk" xmlns:wne="http://schemas.microsoft.com/office/word/2006/wordml" xmlns:wps="http://schemas.microsoft.com/office/word/2010/wordprocessingShape" mc:Ignorable="w14 w15 w16se w16cid w16 w16cex w16sdtdh w16sdtfl w16du wp14">
   <w:endnote w:type="separator" w:id="-1">
     <w:p>
       <w:r>
@@ -672,7 +644,7 @@
 </file>
 
 <file path=word/footer1.xml><?xml version="1.0" encoding="utf-8"?>
-<w:ftr xmlns:wpc="http://schemas.microsoft.com/office/word/2010/wordprocessingCanvas" xmlns:cx="http://schemas.microsoft.com/office/drawing/2014/chartex" xmlns:cx1="http://schemas.microsoft.com/office/drawing/2015/9/8/chartex" xmlns:cx2="http://schemas.microsoft.com/office/drawing/2015/10/21/chartex" xmlns:cx3="http://schemas.microsoft.com/office/drawing/2016/5/9/chartex" xmlns:cx4="http://schemas.microsoft.com/office/drawing/2016/5/10/chartex" xmlns:cx5="http://schemas.microsoft.com/office/drawing/2016/5/11/chartex" xmlns:cx6="http://schemas.microsoft.com/office/drawing/2016/5/12/chartex" xmlns:cx7="http://schemas.microsoft.com/office/drawing/2016/5/13/chartex" xmlns:cx8="http://schemas.microsoft.com/office/drawing/2016/5/14/chartex" xmlns:mc="http://schemas.openxmlformats.org/markup-compatibility/2006" xmlns:aink="http://schemas.microsoft.com/office/drawing/2016/ink" xmlns:am3d="http://schemas.microsoft.com/office/drawing/2017/model3d" xmlns:o="urn:schemas-microsoft-com:office:office" xmlns:oel="http://schemas.microsoft.com/office/2019/extlst" xmlns:r="http://schemas.openxmlformats.org/officeDocument/2006/relationships" xmlns:m="http://schemas.openxmlformats.org/officeDocument/2006/math" xmlns:v="urn:schemas-microsoft-com:vml" xmlns:wp14="http://schemas.microsoft.com/office/word/2010/wordprocessingDrawing" xmlns:wp="http://schemas.openxmlformats.org/drawingml/2006/wordprocessingDrawing" xmlns:w10="urn:schemas-microsoft-com:office:word" xmlns:w="http://schemas.openxmlformats.org/wordprocessingml/2006/main" xmlns:w14="http://schemas.microsoft.com/office/word/2010/wordml" xmlns:w15="http://schemas.microsoft.com/office/word/2012/wordml" xmlns:w16cex="http://schemas.microsoft.com/office/word/2018/wordml/cex" xmlns:w16cid="http://schemas.microsoft.com/office/word/2016/wordml/cid" xmlns:w16="http://schemas.microsoft.com/office/word/2018/wordml" xmlns:w16du="http://schemas.microsoft.com/office/word/2023/wordml/word16du" xmlns:w16sdtdh="http://schemas.microsoft.com/office/word/2020/wordml/sdtdatahash" xmlns:w16sdtfl="http://schemas.microsoft.com/office/word/2024/wordml/sdtformatlock" xmlns:w16se="http://schemas.microsoft.com/office/word/2015/wordml/symex" xmlns:wpg="http://schemas.microsoft.com/office/word/2010/wordprocessingGroup" xmlns:wpi="http://schemas.microsoft.com/office/word/2010/wordprocessingInk" xmlns:wne="http://schemas.microsoft.com/office/word/2006/wordml" xmlns:wps="http://schemas.microsoft.com/office/word/2010/wordprocessingShape" mc:Ignorable="w14 w15 w16se w16cid w16 w16cex w16sdtdh w16sdtfl w16du wp14">
+<w:ftr xmlns:wpc="http://schemas.microsoft.com/office/word/2010/wordprocessingCanvas" xmlns:cx="http://schemas.microsoft.com/office/drawing/2014/chartex" xmlns:cx1="http://schemas.microsoft.com/office/drawing/2015/9/8/chartex" xmlns:cx2="http://schemas.microsoft.com/office/drawing/2015/10/21/chartex" xmlns:cx3="http://schemas.microsoft.com/office/drawing/2016/5/9/chartex" xmlns:cx4="http://schemas.microsoft.com/office/drawing/2016/5/10/chartex" xmlns:cx5="http://schemas.microsoft.com/office/drawing/2016/5/11/chartex" xmlns:cx6="http://schemas.microsoft.com/office/drawing/2016/5/12/chartex" xmlns:cx7="http://schemas.microsoft.com/office/drawing/2016/5/13/chartex" xmlns:cx8="http://schemas.microsoft.com/office/drawing/2016/5/14/chartex" xmlns:mc="http://schemas.openxmlformats.org/markup-compatibility/2006" xmlns:aink="http://schemas.microsoft.com/office/drawing/2016/ink" xmlns:am3d="http://schemas.microsoft.com/office/drawing/2017/model3d" xmlns:o="urn:schemas-microsoft-com:office:office" xmlns:oel="http://schemas.microsoft.com/office/2019/extlst" xmlns:r="http://schemas.openxmlformats.org/officeDocument/2006/relationships" xmlns:m="http://schemas.openxmlformats.org/officeDocument/2006/math" xmlns:v="urn:schemas-microsoft-com:vml" xmlns:wp14="http://schemas.microsoft.com/office/word/2010/wordprocessingDrawing" xmlns:wp="http://schemas.openxmlformats.org/drawingml/2006/wordprocessingDrawing" xmlns:w10="urn:schemas-microsoft-com:office:word" xmlns:w="http://schemas.openxmlformats.org/wordprocessingml/2006/main" xmlns:w14="http://schemas.microsoft.com/office/word/2010/wordml" xmlns:w15="http://schemas.microsoft.com/office/word/2012/wordml" xmlns:w16cei="http://schemas.microsoft.com/office/word/2026/wordml/cei" xmlns:w16cex="http://schemas.microsoft.com/office/word/2018/wordml/cex" xmlns:w16cid="http://schemas.microsoft.com/office/word/2016/wordml/cid" xmlns:w16="http://schemas.microsoft.com/office/word/2018/wordml" xmlns:w16du="http://schemas.microsoft.com/office/word/2023/wordml/word16du" xmlns:w16sdtdh="http://schemas.microsoft.com/office/word/2020/wordml/sdtdatahash" xmlns:w16sdtfl="http://schemas.microsoft.com/office/word/2024/wordml/sdtformatlock" xmlns:w16se="http://schemas.microsoft.com/office/word/2015/wordml/symex" xmlns:wpg="http://schemas.microsoft.com/office/word/2010/wordprocessingGroup" xmlns:wpi="http://schemas.microsoft.com/office/word/2010/wordprocessingInk" xmlns:wne="http://schemas.microsoft.com/office/word/2006/wordml" xmlns:wps="http://schemas.microsoft.com/office/word/2010/wordprocessingShape" mc:Ignorable="w14 w15 w16se w16cid w16 w16cex w16sdtdh w16sdtfl w16du wp14">
   <w:p>
     <w:pPr>
       <w:pStyle w:val="Rodap"/>
@@ -718,7 +690,7 @@
 </file>
 
 <file path=word/footnotes.xml><?xml version="1.0" encoding="utf-8"?>
-<w:footnotes xmlns:wpc="http://schemas.microsoft.com/office/word/2010/wordprocessingCanvas" xmlns:cx="http://schemas.microsoft.com/office/drawing/2014/chartex" xmlns:cx1="http://schemas.microsoft.com/office/drawing/2015/9/8/chartex" xmlns:cx2="http://schemas.microsoft.com/office/drawing/2015/10/21/chartex" xmlns:cx3="http://schemas.microsoft.com/office/drawing/2016/5/9/chartex" xmlns:cx4="http://schemas.microsoft.com/office/drawing/2016/5/10/chartex" xmlns:cx5="http://schemas.microsoft.com/office/drawing/2016/5/11/chartex" xmlns:cx6="http://schemas.microsoft.com/office/drawing/2016/5/12/chartex" xmlns:cx7="http://schemas.microsoft.com/office/drawing/2016/5/13/chartex" xmlns:cx8="http://schemas.microsoft.com/office/drawing/2016/5/14/chartex" xmlns:mc="http://schemas.openxmlformats.org/markup-compatibility/2006" xmlns:aink="http://schemas.microsoft.com/office/drawing/2016/ink" xmlns:am3d="http://schemas.microsoft.com/office/drawing/2017/model3d" xmlns:o="urn:schemas-microsoft-com:office:office" xmlns:oel="http://schemas.microsoft.com/office/2019/extlst" xmlns:r="http://schemas.openxmlformats.org/officeDocument/2006/relationships" xmlns:m="http://schemas.openxmlformats.org/officeDocument/2006/math" xmlns:v="urn:schemas-microsoft-com:vml" xmlns:wp14="http://schemas.microsoft.com/office/word/2010/wordprocessingDrawing" xmlns:wp="http://schemas.openxmlformats.org/drawingml/2006/wordprocessingDrawing" xmlns:w10="urn:schemas-microsoft-com:office:word" xmlns:w="http://schemas.openxmlformats.org/wordprocessingml/2006/main" xmlns:w14="http://schemas.microsoft.com/office/word/2010/wordml" xmlns:w15="http://schemas.microsoft.com/office/word/2012/wordml" xmlns:w16cex="http://schemas.microsoft.com/office/word/2018/wordml/cex" xmlns:w16cid="http://schemas.microsoft.com/office/word/2016/wordml/cid" xmlns:w16="http://schemas.microsoft.com/office/word/2018/wordml" xmlns:w16du="http://schemas.microsoft.com/office/word/2023/wordml/word16du" xmlns:w16sdtdh="http://schemas.microsoft.com/office/word/2020/wordml/sdtdatahash" xmlns:w16sdtfl="http://schemas.microsoft.com/office/word/2024/wordml/sdtformatlock" xmlns:w16se="http://schemas.microsoft.com/office/word/2015/wordml/symex" xmlns:wpg="http://schemas.microsoft.com/office/word/2010/wordprocessingGroup" xmlns:wpi="http://schemas.microsoft.com/office/word/2010/wordprocessingInk" xmlns:wne="http://schemas.microsoft.com/office/word/2006/wordml" xmlns:wps="http://schemas.microsoft.com/office/word/2010/wordprocessingShape" mc:Ignorable="w14 w15 w16se w16cid w16 w16cex w16sdtdh w16sdtfl w16du wp14">
+<w:footnotes xmlns:wpc="http://schemas.microsoft.com/office/word/2010/wordprocessingCanvas" xmlns:cx="http://schemas.microsoft.com/office/drawing/2014/chartex" xmlns:cx1="http://schemas.microsoft.com/office/drawing/2015/9/8/chartex" xmlns:cx2="http://schemas.microsoft.com/office/drawing/2015/10/21/chartex" xmlns:cx3="http://schemas.microsoft.com/office/drawing/2016/5/9/chartex" xmlns:cx4="http://schemas.microsoft.com/office/drawing/2016/5/10/chartex" xmlns:cx5="http://schemas.microsoft.com/office/drawing/2016/5/11/chartex" xmlns:cx6="http://schemas.microsoft.com/office/drawing/2016/5/12/chartex" xmlns:cx7="http://schemas.microsoft.com/office/drawing/2016/5/13/chartex" xmlns:cx8="http://schemas.microsoft.com/office/drawing/2016/5/14/chartex" xmlns:mc="http://schemas.openxmlformats.org/markup-compatibility/2006" xmlns:aink="http://schemas.microsoft.com/office/drawing/2016/ink" xmlns:am3d="http://schemas.microsoft.com/office/drawing/2017/model3d" xmlns:o="urn:schemas-microsoft-com:office:office" xmlns:oel="http://schemas.microsoft.com/office/2019/extlst" xmlns:r="http://schemas.openxmlformats.org/officeDocument/2006/relationships" xmlns:m="http://schemas.openxmlformats.org/officeDocument/2006/math" xmlns:v="urn:schemas-microsoft-com:vml" xmlns:wp14="http://schemas.microsoft.com/office/word/2010/wordprocessingDrawing" xmlns:wp="http://schemas.openxmlformats.org/drawingml/2006/wordprocessingDrawing" xmlns:w10="urn:schemas-microsoft-com:office:word" xmlns:w="http://schemas.openxmlformats.org/wordprocessingml/2006/main" xmlns:w14="http://schemas.microsoft.com/office/word/2010/wordml" xmlns:w15="http://schemas.microsoft.com/office/word/2012/wordml" xmlns:w16cei="http://schemas.microsoft.com/office/word/2026/wordml/cei" xmlns:w16cex="http://schemas.microsoft.com/office/word/2018/wordml/cex" xmlns:w16cid="http://schemas.microsoft.com/office/word/2016/wordml/cid" xmlns:w16="http://schemas.microsoft.com/office/word/2018/wordml" xmlns:w16du="http://schemas.microsoft.com/office/word/2023/wordml/word16du" xmlns:w16sdtdh="http://schemas.microsoft.com/office/word/2020/wordml/sdtdatahash" xmlns:w16sdtfl="http://schemas.microsoft.com/office/word/2024/wordml/sdtformatlock" xmlns:w16se="http://schemas.microsoft.com/office/word/2015/wordml/symex" xmlns:wpg="http://schemas.microsoft.com/office/word/2010/wordprocessingGroup" xmlns:wpi="http://schemas.microsoft.com/office/word/2010/wordprocessingInk" xmlns:wne="http://schemas.microsoft.com/office/word/2006/wordml" xmlns:wps="http://schemas.microsoft.com/office/word/2010/wordprocessingShape" mc:Ignorable="w14 w15 w16se w16cid w16 w16cex w16sdtdh w16sdtfl w16du wp14">
   <w:footnote w:type="separator" w:id="-1">
     <w:p>
       <w:r>
@@ -737,7 +709,7 @@
 </file>
 
 <file path=word/header1.xml><?xml version="1.0" encoding="utf-8"?>
-<w:hdr xmlns:wpc="http://schemas.microsoft.com/office/word/2010/wordprocessingCanvas" xmlns:cx="http://schemas.microsoft.com/office/drawing/2014/chartex" xmlns:cx1="http://schemas.microsoft.com/office/drawing/2015/9/8/chartex" xmlns:cx2="http://schemas.microsoft.com/office/drawing/2015/10/21/chartex" xmlns:cx3="http://schemas.microsoft.com/office/drawing/2016/5/9/chartex" xmlns:cx4="http://schemas.microsoft.com/office/drawing/2016/5/10/chartex" xmlns:cx5="http://schemas.microsoft.com/office/drawing/2016/5/11/chartex" xmlns:cx6="http://schemas.microsoft.com/office/drawing/2016/5/12/chartex" xmlns:cx7="http://schemas.microsoft.com/office/drawing/2016/5/13/chartex" xmlns:cx8="http://schemas.microsoft.com/office/drawing/2016/5/14/chartex" xmlns:mc="http://schemas.openxmlformats.org/markup-compatibility/2006" xmlns:aink="http://schemas.microsoft.com/office/drawing/2016/ink" xmlns:am3d="http://schemas.microsoft.com/office/drawing/2017/model3d" xmlns:o="urn:schemas-microsoft-com:office:office" xmlns:oel="http://schemas.microsoft.com/office/2019/extlst" xmlns:r="http://schemas.openxmlformats.org/officeDocument/2006/relationships" xmlns:m="http://schemas.openxmlformats.org/officeDocument/2006/math" xmlns:v="urn:schemas-microsoft-com:vml" xmlns:wp14="http://schemas.microsoft.com/office/word/2010/wordprocessingDrawing" xmlns:wp="http://schemas.openxmlformats.org/drawingml/2006/wordprocessingDrawing" xmlns:w10="urn:schemas-microsoft-com:office:word" xmlns:w="http://schemas.openxmlformats.org/wordprocessingml/2006/main" xmlns:w14="http://schemas.microsoft.com/office/word/2010/wordml" xmlns:w15="http://schemas.microsoft.com/office/word/2012/wordml" xmlns:w16cex="http://schemas.microsoft.com/office/word/2018/wordml/cex" xmlns:w16cid="http://schemas.microsoft.com/office/word/2016/wordml/cid" xmlns:w16="http://schemas.microsoft.com/office/word/2018/wordml" xmlns:w16du="http://schemas.microsoft.com/office/word/2023/wordml/word16du" xmlns:w16sdtdh="http://schemas.microsoft.com/office/word/2020/wordml/sdtdatahash" xmlns:w16sdtfl="http://schemas.microsoft.com/office/word/2024/wordml/sdtformatlock" xmlns:w16se="http://schemas.microsoft.com/office/word/2015/wordml/symex" xmlns:wpg="http://schemas.microsoft.com/office/word/2010/wordprocessingGroup" xmlns:wpi="http://schemas.microsoft.com/office/word/2010/wordprocessingInk" xmlns:wne="http://schemas.microsoft.com/office/word/2006/wordml" xmlns:wps="http://schemas.microsoft.com/office/word/2010/wordprocessingShape" mc:Ignorable="w14 w15 w16se w16cid w16 w16cex w16sdtdh w16sdtfl w16du wp14">
+<w:hdr xmlns:wpc="http://schemas.microsoft.com/office/word/2010/wordprocessingCanvas" xmlns:cx="http://schemas.microsoft.com/office/drawing/2014/chartex" xmlns:cx1="http://schemas.microsoft.com/office/drawing/2015/9/8/chartex" xmlns:cx2="http://schemas.microsoft.com/office/drawing/2015/10/21/chartex" xmlns:cx3="http://schemas.microsoft.com/office/drawing/2016/5/9/chartex" xmlns:cx4="http://schemas.microsoft.com/office/drawing/2016/5/10/chartex" xmlns:cx5="http://schemas.microsoft.com/office/drawing/2016/5/11/chartex" xmlns:cx6="http://schemas.microsoft.com/office/drawing/2016/5/12/chartex" xmlns:cx7="http://schemas.microsoft.com/office/drawing/2016/5/13/chartex" xmlns:cx8="http://schemas.microsoft.com/office/drawing/2016/5/14/chartex" xmlns:mc="http://schemas.openxmlformats.org/markup-compatibility/2006" xmlns:aink="http://schemas.microsoft.com/office/drawing/2016/ink" xmlns:am3d="http://schemas.microsoft.com/office/drawing/2017/model3d" xmlns:o="urn:schemas-microsoft-com:office:office" xmlns:oel="http://schemas.microsoft.com/office/2019/extlst" xmlns:r="http://schemas.openxmlformats.org/officeDocument/2006/relationships" xmlns:m="http://schemas.openxmlformats.org/officeDocument/2006/math" xmlns:v="urn:schemas-microsoft-com:vml" xmlns:wp14="http://schemas.microsoft.com/office/word/2010/wordprocessingDrawing" xmlns:wp="http://schemas.openxmlformats.org/drawingml/2006/wordprocessingDrawing" xmlns:w10="urn:schemas-microsoft-com:office:word" xmlns:w="http://schemas.openxmlformats.org/wordprocessingml/2006/main" xmlns:w14="http://schemas.microsoft.com/office/word/2010/wordml" xmlns:w15="http://schemas.microsoft.com/office/word/2012/wordml" xmlns:w16cei="http://schemas.microsoft.com/office/word/2026/wordml/cei" xmlns:w16cex="http://schemas.microsoft.com/office/word/2018/wordml/cex" xmlns:w16cid="http://schemas.microsoft.com/office/word/2016/wordml/cid" xmlns:w16="http://schemas.microsoft.com/office/word/2018/wordml" xmlns:w16du="http://schemas.microsoft.com/office/word/2023/wordml/word16du" xmlns:w16sdtdh="http://schemas.microsoft.com/office/word/2020/wordml/sdtdatahash" xmlns:w16sdtfl="http://schemas.microsoft.com/office/word/2024/wordml/sdtformatlock" xmlns:w16se="http://schemas.microsoft.com/office/word/2015/wordml/symex" xmlns:wpg="http://schemas.microsoft.com/office/word/2010/wordprocessingGroup" xmlns:wpi="http://schemas.microsoft.com/office/word/2010/wordprocessingInk" xmlns:wne="http://schemas.microsoft.com/office/word/2006/wordml" xmlns:wps="http://schemas.microsoft.com/office/word/2010/wordprocessingShape" mc:Ignorable="w14 w15 w16se w16cid w16 w16cex w16sdtdh w16sdtfl w16du wp14">
   <w:p>
     <w:pPr>
       <w:pStyle w:val="Cabealho"/>
@@ -806,7 +778,7 @@
 </file>
 
 <file path=word/numbering.xml><?xml version="1.0" encoding="utf-8"?>
-<w:numbering xmlns:wpc="http://schemas.microsoft.com/office/word/2010/wordprocessingCanvas" xmlns:cx="http://schemas.microsoft.com/office/drawing/2014/chartex" xmlns:cx1="http://schemas.microsoft.com/office/drawing/2015/9/8/chartex" xmlns:cx2="http://schemas.microsoft.com/office/drawing/2015/10/21/chartex" xmlns:cx3="http://schemas.microsoft.com/office/drawing/2016/5/9/chartex" xmlns:cx4="http://schemas.microsoft.com/office/drawing/2016/5/10/chartex" xmlns:cx5="http://schemas.microsoft.com/office/drawing/2016/5/11/chartex" xmlns:cx6="http://schemas.microsoft.com/office/drawing/2016/5/12/chartex" xmlns:cx7="http://schemas.microsoft.com/office/drawing/2016/5/13/chartex" xmlns:cx8="http://schemas.microsoft.com/office/drawing/2016/5/14/chartex" xmlns:mc="http://schemas.openxmlformats.org/markup-compatibility/2006" xmlns:aink="http://schemas.microsoft.com/office/drawing/2016/ink" xmlns:am3d="http://schemas.microsoft.com/office/drawing/2017/model3d" xmlns:o="urn:schemas-microsoft-com:office:office" xmlns:oel="http://schemas.microsoft.com/office/2019/extlst" xmlns:r="http://schemas.openxmlformats.org/officeDocument/2006/relationships" xmlns:m="http://schemas.openxmlformats.org/officeDocument/2006/math" xmlns:v="urn:schemas-microsoft-com:vml" xmlns:wp14="http://schemas.microsoft.com/office/word/2010/wordprocessingDrawing" xmlns:wp="http://schemas.openxmlformats.org/drawingml/2006/wordprocessingDrawing" xmlns:w10="urn:schemas-microsoft-com:office:word" xmlns:w="http://schemas.openxmlformats.org/wordprocessingml/2006/main" xmlns:w14="http://schemas.microsoft.com/office/word/2010/wordml" xmlns:w15="http://schemas.microsoft.com/office/word/2012/wordml" xmlns:w16cex="http://schemas.microsoft.com/office/word/2018/wordml/cex" xmlns:w16cid="http://schemas.microsoft.com/office/word/2016/wordml/cid" xmlns:w16="http://schemas.microsoft.com/office/word/2018/wordml" xmlns:w16du="http://schemas.microsoft.com/office/word/2023/wordml/word16du" xmlns:w16sdtdh="http://schemas.microsoft.com/office/word/2020/wordml/sdtdatahash" xmlns:w16sdtfl="http://schemas.microsoft.com/office/word/2024/wordml/sdtformatlock" xmlns:w16se="http://schemas.microsoft.com/office/word/2015/wordml/symex" xmlns:wpg="http://schemas.microsoft.com/office/word/2010/wordprocessingGroup" xmlns:wpi="http://schemas.microsoft.com/office/word/2010/wordprocessingInk" xmlns:wne="http://schemas.microsoft.com/office/word/2006/wordml" xmlns:wps="http://schemas.microsoft.com/office/word/2010/wordprocessingShape" mc:Ignorable="w14 w15 w16se w16cid w16 w16cex w16sdtdh w16sdtfl w16du wp14">
+<w:numbering xmlns:wpc="http://schemas.microsoft.com/office/word/2010/wordprocessingCanvas" xmlns:cx="http://schemas.microsoft.com/office/drawing/2014/chartex" xmlns:cx1="http://schemas.microsoft.com/office/drawing/2015/9/8/chartex" xmlns:cx2="http://schemas.microsoft.com/office/drawing/2015/10/21/chartex" xmlns:cx3="http://schemas.microsoft.com/office/drawing/2016/5/9/chartex" xmlns:cx4="http://schemas.microsoft.com/office/drawing/2016/5/10/chartex" xmlns:cx5="http://schemas.microsoft.com/office/drawing/2016/5/11/chartex" xmlns:cx6="http://schemas.microsoft.com/office/drawing/2016/5/12/chartex" xmlns:cx7="http://schemas.microsoft.com/office/drawing/2016/5/13/chartex" xmlns:cx8="http://schemas.microsoft.com/office/drawing/2016/5/14/chartex" xmlns:mc="http://schemas.openxmlformats.org/markup-compatibility/2006" xmlns:aink="http://schemas.microsoft.com/office/drawing/2016/ink" xmlns:am3d="http://schemas.microsoft.com/office/drawing/2017/model3d" xmlns:o="urn:schemas-microsoft-com:office:office" xmlns:oel="http://schemas.microsoft.com/office/2019/extlst" xmlns:r="http://schemas.openxmlformats.org/officeDocument/2006/relationships" xmlns:m="http://schemas.openxmlformats.org/officeDocument/2006/math" xmlns:v="urn:schemas-microsoft-com:vml" xmlns:wp14="http://schemas.microsoft.com/office/word/2010/wordprocessingDrawing" xmlns:wp="http://schemas.openxmlformats.org/drawingml/2006/wordprocessingDrawing" xmlns:w10="urn:schemas-microsoft-com:office:word" xmlns:w="http://schemas.openxmlformats.org/wordprocessingml/2006/main" xmlns:w14="http://schemas.microsoft.com/office/word/2010/wordml" xmlns:w15="http://schemas.microsoft.com/office/word/2012/wordml" xmlns:w16cei="http://schemas.microsoft.com/office/word/2026/wordml/cei" xmlns:w16cex="http://schemas.microsoft.com/office/word/2018/wordml/cex" xmlns:w16cid="http://schemas.microsoft.com/office/word/2016/wordml/cid" xmlns:w16="http://schemas.microsoft.com/office/word/2018/wordml" xmlns:w16du="http://schemas.microsoft.com/office/word/2023/wordml/word16du" xmlns:w16sdtdh="http://schemas.microsoft.com/office/word/2020/wordml/sdtdatahash" xmlns:w16sdtfl="http://schemas.microsoft.com/office/word/2024/wordml/sdtformatlock" xmlns:w16se="http://schemas.microsoft.com/office/word/2015/wordml/symex" xmlns:wpg="http://schemas.microsoft.com/office/word/2010/wordprocessingGroup" xmlns:wpi="http://schemas.microsoft.com/office/word/2010/wordprocessingInk" xmlns:wne="http://schemas.microsoft.com/office/word/2006/wordml" xmlns:wps="http://schemas.microsoft.com/office/word/2010/wordprocessingShape" mc:Ignorable="w14 w15 w16se w16cid w16 w16cex w16sdtdh w16sdtfl w16du wp14">
   <w:abstractNum w:abstractNumId="0" w15:restartNumberingAfterBreak="0">
     <w:nsid w:val="09E30939"/>
     <w:multiLevelType w:val="hybridMultilevel"/>

</xml_diff>